<commit_message>
docs: rewrite pre-registration — PCA as primary approach, A+B as exploratory
</commit_message>
<xml_diff>
--- a/references/7_Knowledge foraging experiment_ AsPredicted pre-registration.docx
+++ b/references/7_Knowledge foraging experiment_ AsPredicted pre-registration.docx
@@ -487,20 +487,30 @@
           <w:rFonts w:ascii="Assistant" w:cs="Assistant" w:eastAsia="Assistant" w:hAnsi="Assistant"/>
           <w:rtl w:val="0"/>
         </w:rPr>
+      </w:r>
+      <w:r>
+        <w:rPr>
+          <w:rFonts w:ascii="Assistant" w:cs="Assistant" w:eastAsia="Assistant" w:hAnsi="Assistant"/>
+          <w:highlight w:val="yellow"/>
+          <w:rtl w:val="0"/>
+        </w:rPr>
+      </w:r>
+      <w:r>
+        <w:rPr>
+          <w:rtl w:val="0"/>
+        </w:rPr>
+      </w:r>
+      <w:r>
+        <w:rPr>
+          <w:color w:val="000000"/>
+        </w:rPr>
         <w:t xml:space="preserve">We hypothesize that participants in the diffused spatial search condition will exhibit more exploratory information-seeking behavior during the Wikipedia task compared with participants in the clumpy spatial search condition. </w:t>
       </w:r>
       <w:r>
         <w:rPr>
-          <w:rFonts w:ascii="Assistant" w:cs="Assistant" w:eastAsia="Assistant" w:hAnsi="Assistant"/>
-          <w:highlight w:val="yellow"/>
-          <w:rtl w:val="0"/>
-        </w:rPr>
-        <w:t xml:space="preserve">Specifically, we expect diffuse-condition participants to build looser knowledge networks (lower average edge weights, lower clustering coefficients, and longer average path lengths), reflecting more frequent transitions between dissimilar topics</w:t>
-      </w:r>
-      <w:r>
-        <w:rPr>
-          <w:rtl w:val="0"/>
-        </w:rPr>
+          <w:color w:val="CC0000"/>
+        </w:rPr>
+        <w:t>Specifically, we expect diffuse-condition participants to show higher semantic breadth scores (PC2) and potentially different engagement patterns (PC1), as measured by PCA on three raw behavioral signals (page duration, semantic distance, and writing activity). This would indicate that spatial foraging experience transfers to information foraging, consistent with the domain-general search hypothesis (Hills et al., 2008).</w:t>
       </w:r>
     </w:p>
     <w:p>
@@ -562,9 +572,10 @@
       <w:r>
         <w:rPr>
           <w:rFonts w:ascii="Assistant" w:cs="Assistant" w:eastAsia="Assistant" w:hAnsi="Assistant"/>
-          <w:rtl w:val="0"/>
-        </w:rPr>
-        <w:t xml:space="preserve">We will construct knowledge networks from participants’ Wikipedia browsing trajectories following the methodology of Lydon-Staley et al. (2021) and Kedrick et al. (2026). In these networks, each Wikipedia page visited is a node, and edges between consecutively visited pages are weighted by the cosine similarity of their </w:t>
+          <w:color w:val="CC0000"/>
+          <w:rtl w:val="0"/>
+        </w:rPr>
+        <w:t>We will measure exploration-exploitation dynamics using PCA on three raw continuous signals extracted from each page visit during the Wikipedia task. This approach avoids arbitrary thresholds and binary classifications, and lets the data determine the dimensionality of explore/exploit behavior.</w:t>
       </w:r>
       <w:sdt>
         <w:sdtPr>
@@ -580,41 +591,37 @@
           <w:rFonts w:ascii="Assistant" w:cs="Assistant" w:eastAsia="Assistant" w:hAnsi="Assistant"/>
           <w:rtl w:val="0"/>
         </w:rPr>
-        <w:t xml:space="preserve">term-frequency inverse-document-frequency (tf-idf) text vectors</w:t>
       </w:r>
       <w:commentRangeEnd w:id="0"/>
-      <w:r>
-        <w:commentReference w:id="0"/>
-      </w:r>
-      <w:r>
-        <w:rPr>
-          <w:rFonts w:ascii="Assistant" w:cs="Assistant" w:eastAsia="Assistant" w:hAnsi="Assistant"/>
-          <w:rtl w:val="0"/>
-        </w:rPr>
-        <w:t xml:space="preserve">.</w:t>
-      </w:r>
-    </w:p>
-    <w:p>
-      <w:pPr>
-        <w:spacing w:line="360" w:lineRule="auto"/>
-        <w:ind w:left="720" w:firstLine="0"/>
-        <w:jc w:val="both"/>
-        <w:rPr>
-          <w:rFonts w:ascii="Assistant" w:cs="Assistant" w:eastAsia="Assistant" w:hAnsi="Assistant"/>
-        </w:rPr>
-      </w:pPr>
-      <w:r>
-        <w:rPr>
-          <w:rFonts w:ascii="Assistant" w:cs="Assistant" w:eastAsia="Assistant" w:hAnsi="Assistant"/>
-          <w:rtl w:val="0"/>
-        </w:rPr>
-        <w:t xml:space="preserve">We plan to analyze participants’ exploration-exploitation dynamics using two complementary approaches, though the exact analytic strategy will be finalized after piloting:</w:t>
-      </w:r>
-      <w:r>
-        <w:rPr>
-          <w:color w:val="CC0000"/>
-        </w:rPr>
-        <w:t xml:space="preserve"> Based on our pilot data, we have selected Approach C (described below) as the primary analysis.</w:t>
+      <w:r/>
+      <w:r>
+        <w:rPr>
+          <w:rFonts w:ascii="Assistant" w:cs="Assistant" w:eastAsia="Assistant" w:hAnsi="Assistant"/>
+          <w:rtl w:val="0"/>
+        </w:rPr>
+      </w:r>
+    </w:p>
+    <w:p>
+      <w:pPr>
+        <w:spacing w:line="360" w:lineRule="auto"/>
+        <w:ind w:left="720" w:firstLine="0"/>
+        <w:jc w:val="both"/>
+        <w:rPr>
+          <w:rFonts w:ascii="Assistant" w:cs="Assistant" w:eastAsia="Assistant" w:hAnsi="Assistant"/>
+        </w:rPr>
+      </w:pPr>
+      <w:r>
+        <w:rPr>
+          <w:rFonts w:ascii="Assistant" w:cs="Assistant" w:eastAsia="Assistant" w:hAnsi="Assistant"/>
+          <w:color w:val="CC0000"/>
+          <w:rtl w:val="0"/>
+        </w:rPr>
+        <w:t>The three raw signals are:</w:t>
+      </w:r>
+      <w:r>
+        <w:rPr>
+          <w:color w:val="CC0000"/>
+        </w:rPr>
       </w:r>
     </w:p>
     <w:p>
@@ -631,16 +638,16 @@
           <w:rFonts w:ascii="Assistant" w:cs="Assistant" w:eastAsia="Assistant" w:hAnsi="Assistant"/>
           <w:b w:val="1"/>
           <w:bCs w:val="1"/>
-          <w:rtl w:val="0"/>
-        </w:rPr>
-        <w:t xml:space="preserve">Approach A</w:t>
-      </w:r>
-      <w:r>
-        <w:rPr>
-          <w:rFonts w:ascii="Assistant" w:cs="Assistant" w:eastAsia="Assistant" w:hAnsi="Assistant"/>
-          <w:rtl w:val="0"/>
-        </w:rPr>
-        <w:t xml:space="preserve"> </w:t>
+          <w:color w:val="CC0000"/>
+          <w:rtl w:val="0"/>
+        </w:rPr>
+        <w:t>1. Page duration: Time spent on each page in seconds. Longer durations indicate deeper engagement with the content (exploitation-like behavior).</w:t>
+      </w:r>
+      <w:r>
+        <w:rPr>
+          <w:rFonts w:ascii="Assistant" w:cs="Assistant" w:eastAsia="Assistant" w:hAnsi="Assistant"/>
+          <w:rtl w:val="0"/>
+        </w:rPr>
       </w:r>
       <w:r>
         <w:rPr>
@@ -649,48 +656,48 @@
           <w:bCs w:val="1"/>
           <w:rtl w:val="0"/>
         </w:rPr>
-        <w:t xml:space="preserve">- Transition-level classification:</w:t>
-      </w:r>
-      <w:r>
-        <w:rPr>
-          <w:rFonts w:ascii="Assistant" w:cs="Assistant" w:eastAsia="Assistant" w:hAnsi="Assistant"/>
-          <w:rtl w:val="0"/>
-        </w:rPr>
-        <w:t xml:space="preserve"> Each page transition will be classified as exploration (low semantic similarity, indicating a jump to a new topic) or exploitation (high semantic similarity, indicating continued browsing within the same topic) based on a threshold on edge weights. Using this classification, we will identify consecutive bouts of exploration and exploitation and compute:</w:t>
-      </w:r>
-    </w:p>
-    <w:p>
-      <w:pPr>
-        <w:spacing w:line="360" w:lineRule="auto"/>
-        <w:ind w:left="720" w:firstLine="0"/>
-        <w:jc w:val="both"/>
-        <w:rPr>
-          <w:rFonts w:ascii="Assistant" w:cs="Assistant" w:eastAsia="Assistant" w:hAnsi="Assistant"/>
-        </w:rPr>
-      </w:pPr>
-      <w:r>
-        <w:rPr>
-          <w:rFonts w:ascii="Assistant" w:cs="Assistant" w:eastAsia="Assistant" w:hAnsi="Assistant"/>
-          <w:rtl w:val="0"/>
-        </w:rPr>
-        <w:t xml:space="preserve">• Explore-Exploit Switching Rate: The rate of switching between exploitation and exploration phases.</w:t>
-      </w:r>
-    </w:p>
-    <w:p>
-      <w:pPr>
-        <w:spacing w:line="360" w:lineRule="auto"/>
-        <w:ind w:left="720" w:firstLine="0"/>
-        <w:jc w:val="both"/>
-        <w:rPr>
-          <w:rFonts w:ascii="Assistant" w:cs="Assistant" w:eastAsia="Assistant" w:hAnsi="Assistant"/>
-        </w:rPr>
-      </w:pPr>
-      <w:r>
-        <w:rPr>
-          <w:rFonts w:ascii="Assistant" w:cs="Assistant" w:eastAsia="Assistant" w:hAnsi="Assistant"/>
-          <w:rtl w:val="0"/>
-        </w:rPr>
-        <w:t xml:space="preserve">• Tendency to explore vs. exploit: The relative proportion of transitions classified as exploration versus exploitation.</w:t>
+      </w:r>
+      <w:r>
+        <w:rPr>
+          <w:rFonts w:ascii="Assistant" w:cs="Assistant" w:eastAsia="Assistant" w:hAnsi="Assistant"/>
+          <w:rtl w:val="0"/>
+        </w:rPr>
+      </w:r>
+    </w:p>
+    <w:p>
+      <w:pPr>
+        <w:spacing w:line="360" w:lineRule="auto"/>
+        <w:ind w:left="720" w:firstLine="0"/>
+        <w:jc w:val="both"/>
+        <w:rPr>
+          <w:rFonts w:ascii="Assistant" w:cs="Assistant" w:eastAsia="Assistant" w:hAnsi="Assistant"/>
+        </w:rPr>
+      </w:pPr>
+      <w:r>
+        <w:rPr>
+          <w:rFonts w:ascii="Assistant" w:cs="Assistant" w:eastAsia="Assistant" w:hAnsi="Assistant"/>
+          <w:color w:val="CC0000"/>
+          <w:rtl w:val="0"/>
+        </w:rPr>
+        <w:t>2. Semantic distance: Topic shift between consecutive pages, measured via LDA (Latent Dirichlet Allocation) topic modeling and JSD (Jensen-Shannon Divergence). LDA discovers latent topics in the Wikipedia corpus; JSD measures how different the topic distributions of two consecutive pages are. Higher JSD indicates a shift to a different topic (exploration). We chose LDA+JSD over LSA because LSA measures surface-level word overlap, while LDA captures thematic transitions — which directly maps to the concept of exploration as seeking novel information (Zhou et al., 2024). We will test sensitivity to K (number of topics = 5, 10, 15).</w:t>
+      </w:r>
+    </w:p>
+    <w:p>
+      <w:pPr>
+        <w:spacing w:line="360" w:lineRule="auto"/>
+        <w:ind w:left="720" w:firstLine="0"/>
+        <w:jc w:val="both"/>
+        <w:rPr>
+          <w:rFonts w:ascii="Assistant" w:cs="Assistant" w:eastAsia="Assistant" w:hAnsi="Assistant"/>
+        </w:rPr>
+      </w:pPr>
+      <w:r>
+        <w:rPr>
+          <w:rFonts w:ascii="Assistant" w:cs="Assistant" w:eastAsia="Assistant" w:hAnsi="Assistant"/>
+          <w:color w:val="CC0000"/>
+          <w:rtl w:val="0"/>
+        </w:rPr>
+        <w:t>3. Writing activity: A continuous score per page visit combining typing duration (seconds) and number of paste events (weighted at 5 seconds each). This replaces binary classification (writing: yes/no) with a continuous measure that captures the magnitude of content production.</w:t>
       </w:r>
     </w:p>
     <w:p>
@@ -707,67 +714,70 @@
           <w:rFonts w:ascii="Assistant" w:cs="Assistant" w:eastAsia="Assistant" w:hAnsi="Assistant"/>
           <w:b w:val="1"/>
           <w:bCs w:val="1"/>
-          <w:rtl w:val="0"/>
-        </w:rPr>
-        <w:t xml:space="preserve">Approach B - Network-level metrics:</w:t>
-      </w:r>
-      <w:r>
-        <w:rPr>
-          <w:rFonts w:ascii="Assistant" w:cs="Assistant" w:eastAsia="Assistant" w:hAnsi="Assistant"/>
-          <w:rtl w:val="0"/>
-        </w:rPr>
-        <w:t xml:space="preserve"> For each participant, we will compute the following graph-theoretic indices from their knowledge network:</w:t>
-      </w:r>
-    </w:p>
-    <w:p>
-      <w:pPr>
-        <w:spacing w:line="360" w:lineRule="auto"/>
-        <w:ind w:left="720" w:firstLine="0"/>
-        <w:jc w:val="both"/>
-        <w:rPr>
-          <w:rFonts w:ascii="Assistant" w:cs="Assistant" w:eastAsia="Assistant" w:hAnsi="Assistant"/>
-        </w:rPr>
-      </w:pPr>
-      <w:r>
-        <w:rPr>
-          <w:rFonts w:ascii="Assistant" w:cs="Assistant" w:eastAsia="Assistant" w:hAnsi="Assistant"/>
-          <w:rtl w:val="0"/>
-        </w:rPr>
-        <w:t xml:space="preserve">• Average edge weight: The mean semantic similarity between consecutively visited pages. Higher values indicate more exploitative browsing (staying within similar topics); lower values indicate more exploratory browsing.</w:t>
-      </w:r>
-    </w:p>
-    <w:p>
-      <w:pPr>
-        <w:spacing w:line="360" w:lineRule="auto"/>
-        <w:ind w:left="720" w:firstLine="0"/>
-        <w:jc w:val="both"/>
-        <w:rPr>
-          <w:rFonts w:ascii="Assistant" w:cs="Assistant" w:eastAsia="Assistant" w:hAnsi="Assistant"/>
-        </w:rPr>
-      </w:pPr>
-      <w:r>
-        <w:rPr>
-          <w:rFonts w:ascii="Assistant" w:cs="Assistant" w:eastAsia="Assistant" w:hAnsi="Assistant"/>
-          <w:rtl w:val="0"/>
-        </w:rPr>
-        <w:t xml:space="preserve">• Average clustering coefficient: A measure of how tightly interconnected a participant’s visited pages are (Lydon-Staley et al., 2021). Higher clustering indicates tighter, more exploitation-oriented networks.</w:t>
-      </w:r>
-    </w:p>
-    <w:p>
-      <w:pPr>
-        <w:spacing w:line="360" w:lineRule="auto"/>
-        <w:ind w:left="720" w:firstLine="0"/>
-        <w:jc w:val="both"/>
-        <w:rPr>
-          <w:rFonts w:ascii="Assistant" w:cs="Assistant" w:eastAsia="Assistant" w:hAnsi="Assistant"/>
-        </w:rPr>
-      </w:pPr>
-      <w:r>
-        <w:rPr>
-          <w:rFonts w:ascii="Assistant" w:cs="Assistant" w:eastAsia="Assistant" w:hAnsi="Assistant"/>
-          <w:rtl w:val="0"/>
-        </w:rPr>
-        <w:t xml:space="preserve">• Average shortest path length: The mean distance between all pairs of nodes in the network. Longer path lengths indicate looser, more exploration-oriented networks.</w:t>
+          <w:color w:val="CC0000"/>
+          <w:rtl w:val="0"/>
+        </w:rPr>
+        <w:t>The three signals will be standardized (z-score) and submitted to PCA. Mean PC scores will be computed per participant (averaging across all page visits). The dependent variables are determined by a pre-specified decision rule:</w:t>
+      </w:r>
+      <w:r>
+        <w:rPr>
+          <w:rFonts w:ascii="Assistant" w:cs="Assistant" w:eastAsia="Assistant" w:hAnsi="Assistant"/>
+          <w:rtl w:val="0"/>
+        </w:rPr>
+      </w:r>
+    </w:p>
+    <w:p>
+      <w:pPr>
+        <w:spacing w:line="360" w:lineRule="auto"/>
+        <w:ind w:left="720" w:firstLine="0"/>
+        <w:jc w:val="both"/>
+        <w:rPr>
+          <w:rFonts w:ascii="Assistant" w:cs="Assistant" w:eastAsia="Assistant" w:hAnsi="Assistant"/>
+        </w:rPr>
+      </w:pPr>
+      <w:r>
+        <w:rPr>
+          <w:rFonts w:ascii="Assistant" w:cs="Assistant" w:eastAsia="Assistant" w:hAnsi="Assistant"/>
+          <w:color w:val="CC0000"/>
+          <w:rtl w:val="0"/>
+        </w:rPr>
+        <w:t>• If PC1 explains &gt;70% of variance → use PC1 alone as DV (independent samples t-test between conditions).</w:t>
+      </w:r>
+    </w:p>
+    <w:p>
+      <w:pPr>
+        <w:spacing w:line="360" w:lineRule="auto"/>
+        <w:ind w:left="720" w:firstLine="0"/>
+        <w:jc w:val="both"/>
+        <w:rPr>
+          <w:rFonts w:ascii="Assistant" w:cs="Assistant" w:eastAsia="Assistant" w:hAnsi="Assistant"/>
+        </w:rPr>
+      </w:pPr>
+      <w:r>
+        <w:rPr>
+          <w:rFonts w:ascii="Assistant" w:cs="Assistant" w:eastAsia="Assistant" w:hAnsi="Assistant"/>
+          <w:color w:val="CC0000"/>
+          <w:rtl w:val="0"/>
+        </w:rPr>
+        <w:t>• If PC1 + PC2 are both meaningful (combined &gt;80%) → use both as DVs (one-way MANOVA with condition as IV), followed by univariate t-tests on each PC for interpretation.</w:t>
+      </w:r>
+    </w:p>
+    <w:p>
+      <w:pPr>
+        <w:spacing w:line="360" w:lineRule="auto"/>
+        <w:ind w:left="720" w:firstLine="0"/>
+        <w:jc w:val="both"/>
+        <w:rPr>
+          <w:rFonts w:ascii="Assistant" w:cs="Assistant" w:eastAsia="Assistant" w:hAnsi="Assistant"/>
+        </w:rPr>
+      </w:pPr>
+      <w:r>
+        <w:rPr>
+          <w:rFonts w:ascii="Assistant" w:cs="Assistant" w:eastAsia="Assistant" w:hAnsi="Assistant"/>
+          <w:color w:val="CC0000"/>
+          <w:rtl w:val="0"/>
+        </w:rPr>
+        <w:t>Pilot results (N=10, Wikipedia task only): PC1 = 55.7% of variance (engagement: time on page + writing activity), PC2 = 33.3% (semantic breadth: topic distance between pages). Together 89% of variance. The two dimensions are partially independent. Based on pilot results, we expect to use the MANOVA path (two DVs).</w:t>
       </w:r>
     </w:p>
     <w:p/>
@@ -777,69 +787,60 @@
           <w:b/>
           <w:color w:val="CC0000"/>
         </w:rPr>
-        <w:t xml:space="preserve">Approach C (Primary) — PCA on raw continuous signals: </w:t>
-      </w:r>
-      <w:r>
-        <w:rPr>
-          <w:color w:val="CC0000"/>
-        </w:rPr>
-        <w:t>Based on pilot data, we will use PCA on three raw continuous signals measured at each page visit:</w:t>
-      </w:r>
-    </w:p>
-    <w:p>
-      <w:r>
-        <w:rPr>
-          <w:color w:val="CC0000"/>
-        </w:rPr>
-        <w:t>• Page duration: Time spent on each page (seconds).</w:t>
-      </w:r>
-    </w:p>
-    <w:p>
-      <w:r>
-        <w:rPr>
-          <w:color w:val="CC0000"/>
-        </w:rPr>
-        <w:t>• Semantic distance: Topic shift between consecutive pages, measured via LDA topic modeling and Jensen-Shannon Divergence (JSD). We will test sensitivity to the number of topics (K = 5, 10, 15).</w:t>
-      </w:r>
-    </w:p>
-    <w:p>
-      <w:r>
-        <w:rPr>
-          <w:color w:val="CC0000"/>
-        </w:rPr>
-        <w:t>• Writing activity: A continuous score per page visit combining typing duration (seconds) and number of paste events (weighted at 5 seconds each).</w:t>
-      </w:r>
-    </w:p>
-    <w:p>
-      <w:r>
-        <w:rPr>
-          <w:color w:val="CC0000"/>
-        </w:rPr>
-        <w:t>Signals will be standardized (z-score) and submitted to PCA. Mean PC scores will be computed per participant. A pre-specified decision rule determines the analysis:</w:t>
-      </w:r>
-    </w:p>
-    <w:p>
-      <w:r>
-        <w:rPr>
-          <w:color w:val="CC0000"/>
-        </w:rPr>
-        <w:t>• If PC1 explains &gt;70% of variance → use PC1 alone as DV (independent samples t-test).</w:t>
-      </w:r>
-    </w:p>
-    <w:p>
-      <w:r>
-        <w:rPr>
-          <w:color w:val="CC0000"/>
-        </w:rPr>
-        <w:t>• If PC1 + PC2 are both meaningful (combined &gt;80%) → use both as DVs (MANOVA with condition as IV), followed by separate t-tests on each PC.</w:t>
-      </w:r>
-    </w:p>
-    <w:p>
-      <w:r>
-        <w:rPr>
-          <w:color w:val="CC0000"/>
-        </w:rPr>
-        <w:t>Pilot results: PC1 = 55.7% (engagement: time + writing), PC2 = 33.3% (semantic breadth: topic distance). Together 89% of variance. Based on these results, we expect the MANOVA path.</w:t>
+      </w:r>
+      <w:r>
+        <w:rPr>
+          <w:color w:val="CC0000"/>
+        </w:rPr>
+      </w:r>
+    </w:p>
+    <w:p>
+      <w:r>
+        <w:rPr>
+          <w:color w:val="CC0000"/>
+        </w:rPr>
+      </w:r>
+    </w:p>
+    <w:p>
+      <w:r>
+        <w:rPr>
+          <w:color w:val="CC0000"/>
+        </w:rPr>
+      </w:r>
+    </w:p>
+    <w:p>
+      <w:r>
+        <w:rPr>
+          <w:color w:val="CC0000"/>
+        </w:rPr>
+      </w:r>
+    </w:p>
+    <w:p>
+      <w:r>
+        <w:rPr>
+          <w:color w:val="CC0000"/>
+        </w:rPr>
+      </w:r>
+    </w:p>
+    <w:p>
+      <w:r>
+        <w:rPr>
+          <w:color w:val="CC0000"/>
+        </w:rPr>
+      </w:r>
+    </w:p>
+    <w:p>
+      <w:r>
+        <w:rPr>
+          <w:color w:val="CC0000"/>
+        </w:rPr>
+      </w:r>
+    </w:p>
+    <w:p>
+      <w:r>
+        <w:rPr>
+          <w:color w:val="CC0000"/>
+        </w:rPr>
       </w:r>
     </w:p>
     <w:p>
@@ -973,39 +974,38 @@
       <w:r>
         <w:rPr>
           <w:rFonts w:ascii="Assistant" w:cs="Assistant" w:eastAsia="Assistant" w:hAnsi="Assistant"/>
-          <w:rtl w:val="0"/>
-        </w:rPr>
-        <w:t xml:space="preserve">For each dependent variable (as defined in Q3), we will compare the difference between the two conditions (Clumpy vs. Diffuse) using a Welch t-test. If the Shapiro-Wilk test shows a violation of the assumption of normality, we will use the Mann-Whitney U test instead.</w:t>
-      </w:r>
-    </w:p>
-    <w:p>
-      <w:pPr>
-        <w:spacing w:line="360" w:lineRule="auto"/>
-        <w:ind w:left="720" w:firstLine="0"/>
-        <w:jc w:val="both"/>
-        <w:rPr>
-          <w:rFonts w:ascii="Assistant" w:cs="Assistant" w:eastAsia="Assistant" w:hAnsi="Assistant"/>
-        </w:rPr>
-      </w:pPr>
-      <w:r>
-        <w:rPr>
-          <w:rFonts w:ascii="Assistant" w:cs="Assistant" w:eastAsia="Assistant" w:hAnsi="Assistant"/>
-          <w:color w:val="CC0000"/>
-          <w:rtl w:val="0"/>
-        </w:rPr>
-        <w:t xml:space="preserve">As noted in Q3, our primary analysis uses Approach C (PCA on raw signals). </w:t>
-      </w:r>
-      <w:r>
-        <w:rPr>
-          <w:color w:val="CC0000"/>
-        </w:rPr>
-        <w:t xml:space="preserve">Following the pre-specified decision rule: if PC1 &gt; 70%, we will use an independent samples Welch t-test comparing PC1 scores between conditions. If PC1 + PC2 are both meaningful, we will use a one-way MANOVA with condition (Clumpy vs. Diffuse) as IV and PC1 + PC2 scores as DVs, followed by univariate t-tests on each PC. If the Shapiro-Wilk test shows a violation of normality, we will use non-parametric alternatives. </w:t>
-      </w:r>
-      <w:r>
-        <w:rPr>
-          <w:color w:val="CC0000"/>
-        </w:rPr>
-        <w:t>Approaches A (transition-level classification) and B (network-level metrics) will be reported as secondary exploratory analyses.</w:t>
+          <w:color w:val="CC0000"/>
+          <w:rtl w:val="0"/>
+        </w:rPr>
+        <w:t>Primary analysis: Following the pre-specified decision rule from Q3 — if PC1 explains &gt;70% of variance, we will compare PC1 scores between conditions (Clumpy vs. Diffuse) using a Welch t-test. If PC1 + PC2 are both meaningful (combined &gt;80%), we will run a one-way MANOVA with condition as IV and mean PC1 + PC2 scores per participant as DVs, followed by univariate Welch t-tests on each PC. If the Shapiro-Wilk test indicates a violation of normality, we will use non-parametric alternatives (Mann-Whitney U for t-tests, permutation-based MANOVA).</w:t>
+      </w:r>
+    </w:p>
+    <w:p>
+      <w:pPr>
+        <w:spacing w:line="360" w:lineRule="auto"/>
+        <w:ind w:left="720" w:firstLine="0"/>
+        <w:jc w:val="both"/>
+        <w:rPr>
+          <w:rFonts w:ascii="Assistant" w:cs="Assistant" w:eastAsia="Assistant" w:hAnsi="Assistant"/>
+        </w:rPr>
+      </w:pPr>
+      <w:r>
+        <w:rPr>
+          <w:rFonts w:ascii="Assistant" w:cs="Assistant" w:eastAsia="Assistant" w:hAnsi="Assistant"/>
+          <w:color w:val="CC0000"/>
+          <w:rtl w:val="0"/>
+        </w:rPr>
+        <w:t>Effect sizes will be reported as Cohen’s d for t-tests and partial eta-squared for MANOVA.</w:t>
+      </w:r>
+      <w:r>
+        <w:rPr>
+          <w:color w:val="CC0000"/>
+        </w:rPr>
+      </w:r>
+      <w:r>
+        <w:rPr>
+          <w:color w:val="CC0000"/>
+        </w:rPr>
       </w:r>
     </w:p>
     <w:p>
@@ -1180,6 +1180,12 @@
         </w:rPr>
         <w:t xml:space="preserve">Outliers will be defined as participants with a score farther than 3 standard deviations from the mean in any of the primary dependent variables.</w:t>
       </w:r>
+      <w:r>
+        <w:rPr>
+          <w:color w:val="CC0000"/>
+        </w:rPr>
+        <w:t xml:space="preserve"> Additionally, participants whose mean PC1 or PC2 score falls more than 3 standard deviations from the group mean will be flagged as outliers on the PCA-derived dependent variables.</w:t>
+      </w:r>
     </w:p>
     <w:p>
       <w:pPr>
@@ -1315,6 +1321,28 @@
           <w:rtl w:val="0"/>
         </w:rPr>
         <w:t xml:space="preserve">In addition to the primary measures, we will examine the following variables in an exploratory analysis. We have no specific a priori hypotheses on these variables, thus we will simply examine how they differ across conditions, in an exploratory t-test analysis.</w:t>
+      </w:r>
+      <w:r>
+        <w:rPr>
+          <w:color w:val="CC0000"/>
+        </w:rPr>
+        <w:t xml:space="preserve"> Additionally, we will conduct two secondary exploratory analyses:</w:t>
+      </w:r>
+    </w:p>
+    <w:p>
+      <w:r>
+        <w:rPr>
+          <w:color w:val="CC0000"/>
+        </w:rPr>
+        <w:t>Exploratory Analysis A — Transition-level classification: Each page transition classified as exploration (low semantic similarity) or exploitation (high semantic similarity) based on a threshold. DVs: switching rate between phases, proportion of exploration vs. exploitation transitions.</w:t>
+      </w:r>
+    </w:p>
+    <w:p>
+      <w:r>
+        <w:rPr>
+          <w:color w:val="CC0000"/>
+        </w:rPr>
+        <w:t>Exploratory Analysis B — Network-level metrics: Knowledge networks constructed from browsing trajectories (nodes = pages, edges = cosine similarity). DVs: average edge weight, clustering coefficient, average shortest path length (following Lydon-Staley et al., 2021).</w:t>
       </w:r>
     </w:p>
     <w:p>
@@ -1513,9 +1541,10 @@
       <w:r>
         <w:rPr>
           <w:rFonts w:ascii="Assistant" w:cs="Assistant" w:eastAsia="Assistant" w:hAnsi="Assistant"/>
-          <w:rtl w:val="0"/>
-        </w:rPr>
-        <w:t xml:space="preserve">Thesis - Experiment 2 - Spatial Search and Knowledge Foraging</w:t>
+          <w:color w:val="CC0000"/>
+          <w:rtl w:val="0"/>
+        </w:rPr>
+        <w:t>Spatial Foraging and Knowledge Exploration: The Effect of Spatial Search on Information-Seeking Behavior</w:t>
       </w:r>
     </w:p>
     <w:p>

</xml_diff>

<commit_message>
docs: fix hypothesis — identify PCs by loadings, not by number
</commit_message>
<xml_diff>
--- a/references/7_Knowledge foraging experiment_ AsPredicted pre-registration.docx
+++ b/references/7_Knowledge foraging experiment_ AsPredicted pre-registration.docx
@@ -504,13 +504,23 @@
         <w:rPr>
           <w:color w:val="000000"/>
         </w:rPr>
+      </w:r>
+      <w:r>
+        <w:rPr>
+          <w:color w:val="CC0000"/>
+        </w:rPr>
+      </w:r>
+      <w:r>
+        <w:rPr>
+          <w:color w:val="000000"/>
+        </w:rPr>
         <w:t xml:space="preserve">We hypothesize that participants in the diffused spatial search condition will exhibit more exploratory information-seeking behavior during the Wikipedia task compared with participants in the clumpy spatial search condition. </w:t>
       </w:r>
       <w:r>
         <w:rPr>
           <w:color w:val="CC0000"/>
         </w:rPr>
-        <w:t>Specifically, we expect diffuse-condition participants to show higher semantic breadth scores (PC2) and potentially different engagement patterns (PC1), as measured by PCA on three raw behavioral signals (page duration, semantic distance, and writing activity). This would indicate that spatial foraging experience transfers to information foraging, consistent with the domain-general search hypothesis (Hills et al., 2008).</w:t>
+        <w:t>Specifically, we expect diffuse-condition participants to differ on the PCA-derived dimensions of Wikipedia browsing behavior. We will identify each principal component by its loadings (e.g., a component loading primarily on semantic distance will be interpreted as semantic breadth, regardless of whether it is PC1 or PC2). We expect the spatial manipulation to primarily affect the semantic breadth dimension (higher topic-switching), consistent with the domain-general search hypothesis (Hills et al., 2008).</w:t>
       </w:r>
     </w:p>
     <w:p>

</xml_diff>

<commit_message>
docs: fix Q6 outliers (Wikipedia-specific) and soften Q8 exploratory analyses
</commit_message>
<xml_diff>
--- a/references/7_Knowledge foraging experiment_ AsPredicted pre-registration.docx
+++ b/references/7_Knowledge foraging experiment_ AsPredicted pre-registration.docx
@@ -1188,13 +1188,20 @@
           <w:rFonts w:ascii="Assistant" w:cs="Assistant" w:eastAsia="Assistant" w:hAnsi="Assistant"/>
           <w:rtl w:val="0"/>
         </w:rPr>
-        <w:t xml:space="preserve">Outliers will be defined as participants with a score farther than 3 standard deviations from the mean in any of the primary dependent variables.</w:t>
-      </w:r>
-      <w:r>
-        <w:rPr>
-          <w:color w:val="CC0000"/>
-        </w:rPr>
-        <w:t xml:space="preserve"> Additionally, participants whose mean PC1 or PC2 score falls more than 3 standard deviations from the group mean will be flagged as outliers on the PCA-derived dependent variables.</w:t>
+      </w:r>
+      <w:r>
+        <w:rPr>
+          <w:color w:val="CC0000"/>
+        </w:rPr>
+      </w:r>
+      <w:r>
+        <w:t xml:space="preserve">Outliers will be defined as participants with a score farther than 3 standard deviations from the mean in any of the primary dependent variables. </w:t>
+      </w:r>
+      <w:r>
+        <w:rPr>
+          <w:color w:val="CC0000"/>
+        </w:rPr>
+        <w:t>Additionally, participants who visited fewer than 3 unique Wikipedia pages will be excluded, as this provides insufficient data for computing meaningful PCA scores (fewer than 2 page transitions).</w:t>
       </w:r>
     </w:p>
     <w:p>
@@ -1330,29 +1337,34 @@
           <w:rFonts w:ascii="Assistant" w:cs="Assistant" w:eastAsia="Assistant" w:hAnsi="Assistant"/>
           <w:rtl w:val="0"/>
         </w:rPr>
-        <w:t xml:space="preserve">In addition to the primary measures, we will examine the following variables in an exploratory analysis. We have no specific a priori hypotheses on these variables, thus we will simply examine how they differ across conditions, in an exploratory t-test analysis.</w:t>
-      </w:r>
-      <w:r>
-        <w:rPr>
-          <w:color w:val="CC0000"/>
-        </w:rPr>
-        <w:t xml:space="preserve"> Additionally, we will conduct two secondary exploratory analyses:</w:t>
-      </w:r>
-    </w:p>
-    <w:p>
-      <w:r>
-        <w:rPr>
-          <w:color w:val="CC0000"/>
-        </w:rPr>
-        <w:t>Exploratory Analysis A — Transition-level classification: Each page transition classified as exploration (low semantic similarity) or exploitation (high semantic similarity) based on a threshold. DVs: switching rate between phases, proportion of exploration vs. exploitation transitions.</w:t>
-      </w:r>
-    </w:p>
-    <w:p>
-      <w:r>
-        <w:rPr>
-          <w:color w:val="CC0000"/>
-        </w:rPr>
-        <w:t>Exploratory Analysis B — Network-level metrics: Knowledge networks constructed from browsing trajectories (nodes = pages, edges = cosine similarity). DVs: average edge weight, clustering coefficient, average shortest path length (following Lydon-Staley et al., 2021).</w:t>
+      </w:r>
+      <w:r>
+        <w:rPr>
+          <w:color w:val="CC0000"/>
+        </w:rPr>
+      </w:r>
+      <w:r>
+        <w:t>In addition to the primary measures, we will examine the following variables in an exploratory analysis. We have no specific a priori hypotheses on these variables, thus we will simply examine how they differ across conditions, in an exploratory t-test analysis.</w:t>
+      </w:r>
+      <w:r>
+        <w:rPr>
+          <w:color w:val="CC0000"/>
+        </w:rPr>
+        <w:t xml:space="preserve"> We may also explore alternative characterizations of browsing behavior, such as transition-level classification (explore/exploit per page transition) and network-level metrics (e.g., clustering coefficient, average path length; Lydon-Staley et al., 2021).</w:t>
+      </w:r>
+    </w:p>
+    <w:p>
+      <w:r>
+        <w:rPr>
+          <w:color w:val="CC0000"/>
+        </w:rPr>
+      </w:r>
+    </w:p>
+    <w:p>
+      <w:r>
+        <w:rPr>
+          <w:color w:val="CC0000"/>
+        </w:rPr>
       </w:r>
     </w:p>
     <w:p>

</xml_diff>